<commit_message>
TestRound 1 on design
</commit_message>
<xml_diff>
--- a/src/Layers/W1/BaseApp/CRM/DefaultEmailMergeDocBody.docx
+++ b/src/Layers/W1/BaseApp/CRM/DefaultEmailMergeDocBody.docx
@@ -5,17 +5,23 @@
     <w:p/>
     <w:tbl>
       <w:tblPr>
-        <w:tblW w:w="0" w:type="auto"/>
+        <w:tblStyle w:val="BCBlockTable"/>
+        <w:tblW w:w="5000" w:type="pct"/>
         <w:tblCellMar>
           <w:left w:w="0" w:type="dxa"/>
           <w:right w:w="0" w:type="dxa"/>
         </w:tblCellMar>
-        <w:tblLook w:val="0000" w:firstRow="0" w:lastRow="0" w:firstColumn="0" w:lastColumn="0" w:noHBand="0" w:noVBand="0"/>
+        <w:tblLook w:val="0620" w:firstRow="1" w:lastRow="0" w:firstColumn="0" w:lastColumn="0" w:noHBand="1" w:noVBand="1"/>
+        <w:tblCaption w:val="Table 1"/>
+        <w:tblDescription w:val="Layout table. Used for positioning, not for tabular data."/>
       </w:tblPr>
       <w:tblGrid>
         <w:gridCol w:w="10484"/>
       </w:tblGrid>
       <w:tr>
+        <w:trPr>
+          <w:cantSplit/>
+        </w:trPr>
         <w:sdt>
           <w:sdtPr>
             <w:alias w:val="Formal_Salutation"/>
@@ -26,14 +32,16 @@
             </w:placeholder>
             <w15:color w:val="808080"/>
             <w:text/>
-            <w:dataBinding w:prefixMappings="xmlns:ns0='urn:microsoft-dynamics-nav/reports/Email_Merge/5084/'" w:xpath="/ns0:NavWordReportXmlPart[1]/ns0:Integer[1]/ns0:Formal_Salutation[1]"/>
           </w:sdtPr>
           <w:sdtContent>
             <w:tc>
               <w:tcPr>
-                <w:tcW w:w="10484" w:type="dxa"/>
+                <w:tcW w:w="5000" w:type="pct"/>
               </w:tcPr>
               <w:p>
+                <w:pPr>
+                  <w:pStyle w:val="NoSpacing"/>
+                </w:pPr>
                 <w:proofErr w:type="spellStart"/>
                 <w:r>
                   <w:t>Formal_Salutation</w:t>
@@ -45,6 +53,9 @@
         </w:sdt>
       </w:tr>
       <w:tr>
+        <w:trPr>
+          <w:cantSplit/>
+        </w:trPr>
         <w:sdt>
           <w:sdtPr>
             <w:alias w:val="Content"/>
@@ -55,14 +66,16 @@
             </w:placeholder>
             <w15:color w:val="808080"/>
             <w:text/>
-            <w:dataBinding w:prefixMappings="xmlns:ns0='urn:microsoft-dynamics-nav/reports/Email_Merge/5084/'" w:xpath="/ns0:NavWordReportXmlPart[1]/ns0:Integer[1]/ns0:Content[1]"/>
           </w:sdtPr>
           <w:sdtContent>
             <w:tc>
               <w:tcPr>
-                <w:tcW w:w="10484" w:type="dxa"/>
+                <w:tcW w:w="5000" w:type="pct"/>
               </w:tcPr>
               <w:p>
+                <w:pPr>
+                  <w:pStyle w:val="NoSpacing"/>
+                </w:pPr>
                 <w:r>
                   <w:t>Content</w:t>
                 </w:r>
@@ -75,30 +88,35 @@
     <w:p>
       <w:pPr>
         <w:spacing w:after="0" w:line="240" w:lineRule="auto"/>
-        <w:rPr>
-          <w:sz w:val="22"/>
-          <w:szCs w:val="22"/>
-        </w:rPr>
       </w:pPr>
     </w:p>
     <w:tbl>
       <w:tblPr>
-        <w:tblW w:w="0" w:type="auto"/>
+        <w:tblStyle w:val="BCBlockTable"/>
+        <w:tblW w:w="5000" w:type="pct"/>
         <w:tblCellMar>
           <w:left w:w="0" w:type="dxa"/>
           <w:right w:w="0" w:type="dxa"/>
         </w:tblCellMar>
-        <w:tblLook w:val="0000" w:firstRow="0" w:lastRow="0" w:firstColumn="0" w:lastColumn="0" w:noHBand="0" w:noVBand="0"/>
+        <w:tblLook w:val="0620" w:firstRow="1" w:lastRow="0" w:firstColumn="0" w:lastColumn="0" w:noHBand="1" w:noVBand="1"/>
+        <w:tblCaption w:val="Table 2"/>
+        <w:tblDescription w:val="Layout table. Used for positioning, not for tabular data."/>
       </w:tblPr>
       <w:tblGrid>
         <w:gridCol w:w="10484"/>
       </w:tblGrid>
       <w:tr>
+        <w:trPr>
+          <w:cantSplit/>
+        </w:trPr>
         <w:tc>
           <w:tcPr>
-            <w:tcW w:w="10484" w:type="dxa"/>
+            <w:tcW w:w="5000" w:type="pct"/>
           </w:tcPr>
           <w:p>
+            <w:pPr>
+              <w:pStyle w:val="NoSpacing"/>
+            </w:pPr>
             <w:r>
               <w:t>Sincerely,</w:t>
             </w:r>
@@ -106,6 +124,9 @@
         </w:tc>
       </w:tr>
       <w:tr>
+        <w:trPr>
+          <w:cantSplit/>
+        </w:trPr>
         <w:sdt>
           <w:sdtPr>
             <w:alias w:val="SalespersonPurchaser_Name"/>
@@ -116,14 +137,16 @@
             </w:placeholder>
             <w15:color w:val="808080"/>
             <w:text/>
-            <w:dataBinding w:prefixMappings="xmlns:ns0='urn:microsoft-dynamics-nav/reports/Email_Merge/5084/'" w:xpath="/ns0:NavWordReportXmlPart[1]/ns0:Integer[1]/ns0:SalespersonPurchaser_Name[1]"/>
           </w:sdtPr>
           <w:sdtContent>
             <w:tc>
               <w:tcPr>
-                <w:tcW w:w="10484" w:type="dxa"/>
+                <w:tcW w:w="5000" w:type="pct"/>
               </w:tcPr>
               <w:p>
+                <w:pPr>
+                  <w:pStyle w:val="NoSpacing"/>
+                </w:pPr>
                 <w:proofErr w:type="spellStart"/>
                 <w:r>
                   <w:t>SalespersonPurchaser_Name</w:t>
@@ -135,6 +158,9 @@
         </w:sdt>
       </w:tr>
       <w:tr>
+        <w:trPr>
+          <w:cantSplit/>
+        </w:trPr>
         <w:sdt>
           <w:sdtPr>
             <w:alias w:val="SalespersonPurchaser_Job_Title"/>
@@ -145,14 +171,16 @@
             </w:placeholder>
             <w15:color w:val="808080"/>
             <w:text/>
-            <w:dataBinding w:prefixMappings="xmlns:ns0='urn:microsoft-dynamics-nav/reports/Email_Merge/5084/'" w:xpath="/ns0:NavWordReportXmlPart[1]/ns0:Integer[1]/ns0:SalespersonPurchaser_Job_Title[1]"/>
           </w:sdtPr>
           <w:sdtContent>
             <w:tc>
               <w:tcPr>
-                <w:tcW w:w="10484" w:type="dxa"/>
+                <w:tcW w:w="5000" w:type="pct"/>
               </w:tcPr>
               <w:p>
+                <w:pPr>
+                  <w:pStyle w:val="NoSpacing"/>
+                </w:pPr>
                 <w:proofErr w:type="spellStart"/>
                 <w:r>
                   <w:t>SalespersonPurchaser_Job_Title</w:t>
@@ -613,6 +641,251 @@
     <w:rPr>
       <w:color w:val="666666"/>
     </w:rPr>
+  </w:style>
+  <w:style w:type="paragraph" w:styleId="NoSpacing">
+    <w:name w:val="No Spacing"/>
+    <w:uiPriority w:val="1"/>
+    <w:qFormat/>
+    <w:rsid w:val="00416FC2"/>
+    <w:pPr>
+      <w:spacing w:after="0" w:line="240" w:lineRule="auto"/>
+    </w:pPr>
+    <w:rPr>
+      <w:rFonts w:asciiTheme="minorHAnsi" w:hAnsiTheme="minorHAnsi" w:eastAsiaTheme="minorHAnsi" w:cstheme="minorBidi"/>
+      <w:color w:val="242424" w:themeColor="text1"/>
+    </w:rPr>
+  </w:style>
+  <w:style w:type="paragraph" w:customStyle="1" w:styleId="BCNumber">
+    <w:name w:val="BC Number"/>
+    <w:basedOn w:val="NoSpacing"/>
+    <w:next w:val="Normal"/>
+    <w:uiPriority w:val="2"/>
+    <w:qFormat/>
+    <w:pPr>
+      <w:spacing w:before="0" w:after="0" w:line="240" w:lineRule="auto"/>
+    </w:pPr>
+    <w:rPr>
+      <w:rFonts w:asciiTheme="minorHAnsi" w:hAnsiTheme="minorHAnsi" w:eastAsiaTheme="minorHAnsi" w:cstheme="minorBidi"/>
+      <w:color w:val="242424" w:themeColor="text1"/>
+      <w14:numForm w14:val="tabular"/>
+      <w14:numSpacing w14:val="tabular"/>
+    </w:rPr>
+  </w:style>
+  <w:style w:type="paragraph" w:customStyle="1" w:styleId="BCLabel">
+    <w:name w:val="BC Label"/>
+    <w:basedOn w:val="NoSpacing"/>
+    <w:next w:val="Normal"/>
+    <w:uiPriority w:val="2"/>
+    <w:qFormat/>
+    <w:pPr>
+      <w:keepNext/>
+      <w:spacing w:before="0" w:after="0" w:line="240" w:lineRule="auto"/>
+    </w:pPr>
+    <w:rPr>
+      <w:rFonts w:asciiTheme="majorHAnsi" w:hAnsiTheme="majorHAnsi" w:eastAsiaTheme="majorEastAsia" w:cstheme="majorBidi"/>
+      <w:color w:val="242424" w:themeColor="text1"/>
+    </w:rPr>
+  </w:style>
+  <w:style w:type="paragraph" w:customStyle="1" w:styleId="BCLabelNumber">
+    <w:name w:val="BC Label Number"/>
+    <w:basedOn w:val="BCLabel"/>
+    <w:next w:val="Normal"/>
+    <w:uiPriority w:val="2"/>
+    <w:qFormat/>
+    <w:pPr>
+      <w:spacing w:before="0" w:after="0" w:line="240" w:lineRule="auto"/>
+    </w:pPr>
+    <w:rPr>
+      <w:rFonts w:asciiTheme="majorHAnsi" w:hAnsiTheme="majorHAnsi" w:eastAsiaTheme="majorEastAsia" w:cstheme="majorBidi"/>
+      <w:color w:val="242424" w:themeColor="text1"/>
+      <w14:numForm w14:val="tabular"/>
+      <w14:numSpacing w14:val="tabular"/>
+    </w:rPr>
+  </w:style>
+  <w:style w:type="table" w:customStyle="1" w:styleId="BCBlockTable">
+    <w:name w:val="BC Block Table"/>
+    <w:basedOn w:val="TableNormal"/>
+    <w:uiPriority w:val="99"/>
+    <w:qFormat/>
+    <w:pPr>
+      <w:spacing w:before="0" w:after="0" w:line="240" w:lineRule="auto"/>
+    </w:pPr>
+    <w:tblPr>
+      <w:tblStyleRowBandSize w:val="1"/>
+      <w:tblStyleColBandSize w:val="1"/>
+      <w:tblCellMar>
+        <w:top w:w="0" w:type="dxa"/>
+        <w:left w:w="0" w:type="dxa"/>
+        <w:bottom w:w="0" w:type="dxa"/>
+        <w:right w:w="0" w:type="dxa"/>
+      </w:tblCellMar>
+    </w:tblPr>
+    <w:tcPr>
+      <w:vAlign w:val="top"/>
+    </w:tcPr>
+    <w:tblStylePr w:type="firstRow">
+      <w:rPr>
+        <w:rFonts w:asciiTheme="majorHAnsi" w:hAnsiTheme="majorHAnsi" w:cstheme="majorBidi"/>
+      </w:rPr>
+      <w:tcPr>
+        <w:vAlign w:val="top"/>
+      </w:tcPr>
+    </w:tblStylePr>
+  </w:style>
+  <w:style w:type="table" w:customStyle="1" w:styleId="BCDataTable">
+    <w:name w:val="BC Data Table"/>
+    <w:basedOn w:val="TableNormal"/>
+    <w:uiPriority w:val="99"/>
+    <w:qFormat/>
+    <w:pPr>
+      <w:spacing w:before="0" w:after="0" w:line="240" w:lineRule="auto"/>
+    </w:pPr>
+    <w:tblPr>
+      <w:tblStyleRowBandSize w:val="1"/>
+      <w:tblStyleColBandSize w:val="1"/>
+      <w:tblCellMar>
+        <w:top w:w="0" w:type="dxa"/>
+        <w:left w:w="115" w:type="dxa"/>
+        <w:bottom w:w="0" w:type="dxa"/>
+        <w:right w:w="115" w:type="dxa"/>
+      </w:tblCellMar>
+    </w:tblPr>
+    <w:tcPr>
+      <w:vAlign w:val="center"/>
+    </w:tcPr>
+    <w:tblStylePr w:type="firstRow">
+      <w:pPr>
+        <w:spacing w:before="160" w:after="80"/>
+      </w:pPr>
+      <w:rPr>
+        <w:rFonts w:asciiTheme="majorHAnsi" w:hAnsiTheme="majorHAnsi" w:cstheme="majorBidi"/>
+      </w:rPr>
+      <w:tcPr>
+        <w:tcBorders>
+          <w:bottom w:val="single" w:sz="4" w:space="0" w:color="242424" w:themeColor="text1"/>
+        </w:tcBorders>
+        <w:vAlign w:val="top"/>
+      </w:tcPr>
+    </w:tblStylePr>
+    <w:tblStylePr w:type="lastRow">
+      <w:tcPr>
+        <w:tcBorders>
+          <w:bottom w:val="single" w:sz="4" w:space="0" w:color="F5F7F8" w:themeColor="background2"/>
+        </w:tcBorders>
+      </w:tcPr>
+    </w:tblStylePr>
+    <w:tblStylePr w:type="band1Horz">
+      <w:tcPr>
+        <w:shd w:val="clear" w:color="auto" w:fill="auto"/>
+      </w:tcPr>
+    </w:tblStylePr>
+    <w:tblStylePr w:type="band2Horz">
+      <w:tcPr>
+        <w:shd w:val="clear" w:color="auto" w:fill="CCE6E9" w:themeFill="accent2" w:themeFillTint="33"/>
+      </w:tcPr>
+    </w:tblStylePr>
+  </w:style>
+  <w:style w:type="table" w:customStyle="1" w:styleId="BCTotalsTable">
+    <w:name w:val="BC Totals Table"/>
+    <w:basedOn w:val="TableNormal"/>
+    <w:uiPriority w:val="99"/>
+    <w:qFormat/>
+    <w:pPr>
+      <w:spacing w:before="0" w:after="0" w:line="240" w:lineRule="auto"/>
+    </w:pPr>
+    <w:tblPr>
+      <w:tblStyleRowBandSize w:val="1"/>
+      <w:tblStyleColBandSize w:val="1"/>
+      <w:tblCellMar>
+        <w:top w:w="0" w:type="dxa"/>
+        <w:left w:w="115" w:type="dxa"/>
+        <w:bottom w:w="0" w:type="dxa"/>
+        <w:right w:w="115" w:type="dxa"/>
+      </w:tblCellMar>
+    </w:tblPr>
+    <w:tcPr>
+      <w:vAlign w:val="center"/>
+    </w:tcPr>
+    <w:tblStylePr w:type="lastRow">
+      <w:rPr>
+        <w:rFonts w:asciiTheme="majorHAnsi" w:hAnsiTheme="majorHAnsi" w:cstheme="majorBidi"/>
+      </w:rPr>
+      <w:tcPr>
+        <w:tcBorders>
+          <w:top w:val="single" w:sz="4" w:space="0" w:color="242424" w:themeColor="text1"/>
+          <w:bottom w:val="single" w:sz="8" w:space="0" w:color="242424" w:themeColor="text1"/>
+        </w:tcBorders>
+      </w:tcPr>
+    </w:tblStylePr>
+  </w:style>
+  <w:style w:type="table" w:customStyle="1" w:styleId="BCCalculationTable">
+    <w:name w:val="BC Calculation Table"/>
+    <w:basedOn w:val="TableNormal"/>
+    <w:uiPriority w:val="99"/>
+    <w:qFormat/>
+    <w:pPr>
+      <w:spacing w:before="0" w:after="0" w:line="240" w:lineRule="auto"/>
+    </w:pPr>
+    <w:tblPr>
+      <w:tblStyleRowBandSize w:val="1"/>
+      <w:tblStyleColBandSize w:val="1"/>
+      <w:tblCellMar>
+        <w:top w:w="58" w:type="dxa"/>
+        <w:left w:w="0" w:type="dxa"/>
+        <w:bottom w:w="58" w:type="dxa"/>
+        <w:right w:w="0" w:type="dxa"/>
+      </w:tblCellMar>
+    </w:tblPr>
+    <w:tcPr>
+      <w:vAlign w:val="center"/>
+    </w:tcPr>
+    <w:tblStylePr w:type="firstRow">
+      <w:rPr>
+        <w:rFonts w:asciiTheme="majorHAnsi" w:hAnsiTheme="majorHAnsi" w:cstheme="majorBidi"/>
+      </w:rPr>
+      <w:tcPr>
+        <w:vAlign w:val="bottom"/>
+      </w:tcPr>
+    </w:tblStylePr>
+    <w:tblStylePr w:type="lastRow">
+      <w:rPr>
+        <w:rFonts w:asciiTheme="majorHAnsi" w:hAnsiTheme="majorHAnsi" w:cstheme="majorBidi"/>
+      </w:rPr>
+      <w:tcPr>
+        <w:tcBorders>
+          <w:top w:val="single" w:sz="4" w:space="0" w:color="242424" w:themeColor="text1"/>
+        </w:tcBorders>
+      </w:tcPr>
+    </w:tblStylePr>
+  </w:style>
+  <w:style w:type="table" w:customStyle="1" w:styleId="BCSignatureTable">
+    <w:name w:val="BC Signature Table"/>
+    <w:basedOn w:val="TableNormal"/>
+    <w:uiPriority w:val="99"/>
+    <w:qFormat/>
+    <w:pPr>
+      <w:spacing w:before="0" w:after="0" w:line="240" w:lineRule="auto"/>
+    </w:pPr>
+    <w:tblPr>
+      <w:tblStyleRowBandSize w:val="1"/>
+      <w:tblStyleColBandSize w:val="1"/>
+      <w:tblCellMar>
+        <w:top w:w="0" w:type="dxa"/>
+        <w:left w:w="0" w:type="dxa"/>
+        <w:bottom w:w="0" w:type="dxa"/>
+        <w:right w:w="0" w:type="dxa"/>
+      </w:tblCellMar>
+    </w:tblPr>
+    <w:tcPr>
+      <w:vAlign w:val="top"/>
+    </w:tcPr>
+    <w:tblStylePr w:type="lastRow">
+      <w:tcPr>
+        <w:tcBorders>
+          <w:bottom w:val="single" w:sz="4" w:space="0" w:color="242424" w:themeColor="text1"/>
+        </w:tcBorders>
+      </w:tcPr>
+    </w:tblStylePr>
   </w:style>
 </w:styles>
 </file>
@@ -1504,9 +1777,7 @@
 </we:webextension>
 </file>
 
-<file path=customXml/item1.xml>��< ? x m l   v e r s i o n = " 1 . 0 "   e n c o d i n g = " u t f - 1 6 " ? > - 
- < N a v W o r d R e p o r t X m l P a r t   x m l n s = " u r n : m i c r o s o f t - d y n a m i c s - n a v / r e p o r t s / E m a i l _ M e r g e / 5 0 8 4 / " > +<file path=customXml/item1.xml>��< ? x m l   v e r s i o n = " 1 . 0 "   e n c o d i n g = " u t f - 1 6 " ? > < N a v W o r d R e p o r t X m l P a r t   x m l n s = " u r n : m i c r o s o f t - d y n a m i c s - n a v / r e p o r t s / E m a i l _ M e r g e / 5 0 8 4 / " >   
      < B C R e p o r t I n f o r m a t i o n >   
@@ -1570,84 +1841,6 @@
  
          < / R e p o r t R e q u e s t >   
-         < C o m p a n y M e t a d a t a > - 
-             < C o m p a n y N a m e > C o m p a n y   N a m e < / C o m p a n y N a m e > - 
-             < C o m p a n y D i s p l a y N a m e > C o m p a n y   D i s p l a y   N a m e < / C o m p a n y D i s p l a y N a m e > - 
-             < C o m p a n y A d d r e s s L i n e s > - 
-                 < C o m p a n y A d d r e s s L i n e > C o m p a n y   A d d r e s s   L i n e   1 < / C o m p a n y A d d r e s s L i n e > - 
-                 < C o m p a n y A d d r e s s L i n e > C o m p a n y   A d d r e s s   L i n e   2 < / C o m p a n y A d d r e s s L i n e > - 
-                 < C o m p a n y A d d r e s s L i n e > C o m p a n y   A d d r e s s   L i n e   3 < / C o m p a n y A d d r e s s L i n e > - 
-                 < C o m p a n y A d d r e s s L i n e > C o m p a n y   A d d r e s s   L i n e   4 < / C o m p a n y A d d r e s s L i n e > - 
-                 < C o m p a n y A d d r e s s L i n e > C o m p a n y   A d d r e s s   L i n e   5 < / C o m p a n y A d d r e s s L i n e > - 
-                 < C o m p a n y A d d r e s s L i n e > C o m p a n y   A d d r e s s   L i n e   6 < / C o m p a n y A d d r e s s L i n e > - 
-                 < C o m p a n y A d d r e s s L i n e > C o m p a n y   A d d r e s s   L i n e   7 < / C o m p a n y A d d r e s s L i n e > - 
-                 < C o m p a n y A d d r e s s L i n e > C o m p a n y   A d d r e s s   L i n e   8 < / C o m p a n y A d d r e s s L i n e > - 
-             < / C o m p a n y A d d r e s s L i n e s > - 
-             < C o m p a n y P h o n e > C o m p a n y   P h o n e < / C o m p a n y P h o n e > - 
-             < C o m p a n y P h o n e C a p t i o n > C o m p a n y   P h o n e   C a p t i o n < / C o m p a n y P h o n e C a p t i o n > - 
-             < C o m p a n y F a x N o > C o m p a n y   F a x   N o . < / C o m p a n y F a x N o > - 
-             < C o m p a n y F a x N o C a p t i o n > C o m p a n y   F a x   N o .   C a p t i o n < / C o m p a n y F a x N o C a p t i o n > - 
-             < C o m p a n y E m a i l > C o m p a n y   E m a i l < / C o m p a n y E m a i l > - 
-             < C o m p a n y E m a i l C a p t i o n > C o m p a n y   E m a i l   C a p t i o n < / C o m p a n y E m a i l C a p t i o n > - 
-             < C o m p a n y H o m e P a g e > C o m p a n y   H o m e   P a g e < / C o m p a n y H o m e P a g e > - 
-             < C o m p a n y H o m e P a g e C a p t i o n > C o m p a n y   H o m e   P a g e   C a p t i o n < / C o m p a n y H o m e P a g e C a p t i o n > - 
-             < C o m p a n y L o g o > C o m p a n y   L o g o < / C o m p a n y L o g o > - 
-             < C o m p a n y V A T R e g i s t r a t i o n N o > C o m p a n y   V A T   R e g i s t r a t i o n   N o . < / C o m p a n y V A T R e g i s t r a t i o n N o > - 
-             < C o m p a n y V A T R e g i s t r a t i o n N o C a p t i o n > C o m p a n y   V A T   R e g i s t r a t i o n   N o .   C a p t i o n < / C o m p a n y V A T R e g i s t r a t i o n N o C a p t i o n > - 
-             < C o m p a n y R e g i s t r a t i o n N o > C o m p a n y   R e g i s t r a t i o n   N o . < / C o m p a n y R e g i s t r a t i o n N o > - 
-             < C o m p a n y R e g i s t r a t i o n N o C a p t i o n > C o m p a n y   R e g i s t r a t i o n   N o .   C a p t i o n < / C o m p a n y R e g i s t r a t i o n N o C a p t i o n > - 
-             < C o m p a n y B a n k N a m e > C o m p a n y   B a n k   N a m e < / C o m p a n y B a n k N a m e > - 
-             < C o m p a n y B a n k N a m e C a p t i o n > C o m p a n y   B a n k   N a m e   C a p t i o n < / C o m p a n y B a n k N a m e C a p t i o n > - 
-             < C o m p a n y B a n k A c c o u n t N o > C o m p a n y   B a n k   A c c o u n t   N o . < / C o m p a n y B a n k A c c o u n t N o > - 
-             < C o m p a n y B a n k A c c o u n t N o C a p t i o n > C o m p a n y   B a n k   A c c o u n t   N o .   C a p t i o n < / C o m p a n y B a n k A c c o u n t N o C a p t i o n > - 
-             < C o m p a n y B a n k B r a n c h N o > C o m p a n y   B a n k   B r a n c h   N o . < / C o m p a n y B a n k B r a n c h N o > - 
-             < C o m p a n y B a n k B r a n c h N o C a p t i o n > C o m p a n y   B a n k   B r a n c h   N o .   C a p t i o n < / C o m p a n y B a n k B r a n c h N o C a p t i o n > - 
-             < C o m p a n y I B A N > C o m p a n y   I B A N < / C o m p a n y I B A N > - 
-             < C o m p a n y I B A N C a p t i o n > C o m p a n y   I B A N   C a p t i o n < / C o m p a n y I B A N C a p t i o n > - 
-             < C o m p a n y B a n k S W I F T > C o m p a n y   B a n k   S W I F T < / C o m p a n y B a n k S W I F T > - 
-             < C o m p a n y B a n k S W I F T C a p t i o n > C o m p a n y   B a n k   S W I F T   C a p t i o n < / C o m p a n y B a n k S W I F T C a p t i o n > - 
-             < C o m p a n y G i r o N o > C o m p a n y   G i r o   N o . < / C o m p a n y G i r o N o > - 
-             < C o m p a n y G i r o N o C a p t i o n > C o m p a n y   G i r o   N o .   C a p t i o n < / C o m p a n y G i r o N o C a p t i o n > - 
-         < / C o m p a n y M e t a d a t a > - 
      < / B C R e p o r t I n f o r m a t i o n >   
      < I n t e g e r > @@ -1660,7 +1853,7 @@
  
          < C o m p a n y _ I n f o r m a t i o n _ N a m e > C o m p a n y _ I n f o r m a t i o n _ N a m e < / C o m p a n y _ I n f o r m a t i o n _ N a m e >   
-         < C o m p a n y _ I n f o r m a t i o n _ P i c t u r e   / > +         < C o m p a n y _ I n f o r m a t i o n _ P i c t u r e / >   
          < C o m p a n y _ I n f o r m a t i o n _ P o s t _ C o d e > C o m p a n y _ I n f o r m a t i o n _ P o s t _ C o d e < / C o m p a n y _ I n f o r m a t i o n _ P o s t _ C o d e >   
@@ -1683,9 +1876,7 @@
  < / N a v W o r d R e p o r t X m l P a r t > 
 </file>
 
-<file path=customXml/item2.xml>��< ? x m l   v e r s i o n = " 1 . 0 "   e n c o d i n g = " u t f - 1 6 " ? > - 
- < N a v W o r d R e p o r t X m l P a r t   x m l n s = " u r n : m i c r o s o f t - d y n a m i c s - b u s i n e s s c e n t r a l / i n t e r n a l / e x t e n d e d / r e p o r t s / E m a i l _ M e r g e / 5 0 8 4 / " > +<file path=customXml/item2.xml>��< ? x m l   v e r s i o n = " 1 . 0 "   e n c o d i n g = " u t f - 1 6 " ? > < N a v W o r d R e p o r t X m l P a r t   x m l n s = " u r n : m i c r o s o f t - d y n a m i c s - b u s i n e s s c e n t r a l / i n t e r n a l / e x t e n d e d / r e p o r t s / E m a i l _ M e r g e / 5 0 8 4 / " >   
      < B C R e p o r t I n f o r m a t i o n >   
@@ -1749,137 +1940,9 @@
  
          < / R e p o r t R e q u e s t >   
-         < C o m p a n y M e t a d a t a > - 
-             < C o m p a n y N a m e > C o m p a n y   N a m e < / C o m p a n y N a m e > - 
-             < C o m p a n y D i s p l a y N a m e > C o m p a n y   D i s p l a y   N a m e < / C o m p a n y D i s p l a y N a m e > - 
-             < C o m p a n y A d d r e s s L i n e s > - 
-                 < C o m p a n y A d d r e s s L i n e > C o m p a n y   A d d r e s s   L i n e   1 < / C o m p a n y A d d r e s s L i n e > - 
-                 < C o m p a n y A d d r e s s L i n e > C o m p a n y   A d d r e s s   L i n e   2 < / C o m p a n y A d d r e s s L i n e > - 
-                 < C o m p a n y A d d r e s s L i n e > C o m p a n y   A d d r e s s   L i n e   3 < / C o m p a n y A d d r e s s L i n e > - 
-                 < C o m p a n y A d d r e s s L i n e > C o m p a n y   A d d r e s s   L i n e   4 < / C o m p a n y A d d r e s s L i n e > - 
-                 < C o m p a n y A d d r e s s L i n e > C o m p a n y   A d d r e s s   L i n e   5 < / C o m p a n y A d d r e s s L i n e > - 
-                 < C o m p a n y A d d r e s s L i n e > C o m p a n y   A d d r e s s   L i n e   6 < / C o m p a n y A d d r e s s L i n e > - 
-                 < C o m p a n y A d d r e s s L i n e > C o m p a n y   A d d r e s s   L i n e   7 < / C o m p a n y A d d r e s s L i n e > - 
-                 < C o m p a n y A d d r e s s L i n e > C o m p a n y   A d d r e s s   L i n e   8 < / C o m p a n y A d d r e s s L i n e > - 
-             < / C o m p a n y A d d r e s s L i n e s > - 
-             < C o m p a n y P h o n e > C o m p a n y   P h o n e < / C o m p a n y P h o n e > - 
-             < C o m p a n y P h o n e C a p t i o n > C o m p a n y   P h o n e   C a p t i o n < / C o m p a n y P h o n e C a p t i o n > - 
-             < C o m p a n y F a x N o > C o m p a n y   F a x   N o . < / C o m p a n y F a x N o > - 
-             < C o m p a n y F a x N o C a p t i o n > C o m p a n y   F a x   N o .   C a p t i o n < / C o m p a n y F a x N o C a p t i o n > - 
-             < C o m p a n y E m a i l > C o m p a n y   E m a i l < / C o m p a n y E m a i l > - 
-             < C o m p a n y E m a i l C a p t i o n > C o m p a n y   E m a i l   C a p t i o n < / C o m p a n y E m a i l C a p t i o n > - 
-             < C o m p a n y H o m e P a g e > C o m p a n y   H o m e   P a g e < / C o m p a n y H o m e P a g e > - 
-             < C o m p a n y H o m e P a g e C a p t i o n > C o m p a n y   H o m e   P a g e   C a p t i o n < / C o m p a n y H o m e P a g e C a p t i o n > - 
-             < C o m p a n y L o g o > C o m p a n y   L o g o < / C o m p a n y L o g o > - 
-             < C o m p a n y V A T R e g i s t r a t i o n N o > C o m p a n y   V A T   R e g i s t r a t i o n   N o . < / C o m p a n y V A T R e g i s t r a t i o n N o > - 
-             < C o m p a n y V A T R e g i s t r a t i o n N o C a p t i o n > C o m p a n y   V A T   R e g i s t r a t i o n   N o .   C a p t i o n < / C o m p a n y V A T R e g i s t r a t i o n N o C a p t i o n > - 
-             < C o m p a n y R e g i s t r a t i o n N o > C o m p a n y   R e g i s t r a t i o n   N o . < / C o m p a n y R e g i s t r a t i o n N o > - 
-             < C o m p a n y R e g i s t r a t i o n N o C a p t i o n > C o m p a n y   R e g i s t r a t i o n   N o .   C a p t i o n < / C o m p a n y R e g i s t r a t i o n N o C a p t i o n > - 
-             < C o m p a n y B a n k N a m e > C o m p a n y   B a n k   N a m e < / C o m p a n y B a n k N a m e > - 
-             < C o m p a n y B a n k N a m e C a p t i o n > C o m p a n y   B a n k   N a m e   C a p t i o n < / C o m p a n y B a n k N a m e C a p t i o n > - 
-             < C o m p a n y B a n k A c c o u n t N o > C o m p a n y   B a n k   A c c o u n t   N o . < / C o m p a n y B a n k A c c o u n t N o > - 
-             < C o m p a n y B a n k A c c o u n t N o C a p t i o n > C o m p a n y   B a n k   A c c o u n t   N o .   C a p t i o n < / C o m p a n y B a n k A c c o u n t N o C a p t i o n > - 
-             < C o m p a n y B a n k B r a n c h N o > C o m p a n y   B a n k   B r a n c h   N o . < / C o m p a n y B a n k B r a n c h N o > - 
-             < C o m p a n y B a n k B r a n c h N o C a p t i o n > C o m p a n y   B a n k   B r a n c h   N o .   C a p t i o n < / C o m p a n y B a n k B r a n c h N o C a p t i o n > - 
-             < C o m p a n y I B A N > C o m p a n y   I B A N < / C o m p a n y I B A N > - 
-             < C o m p a n y I B A N C a p t i o n > C o m p a n y   I B A N   C a p t i o n < / C o m p a n y I B A N C a p t i o n > - 
-             < C o m p a n y B a n k S W I F T > C o m p a n y   B a n k   S W I F T < / C o m p a n y B a n k S W I F T > - 
-             < C o m p a n y B a n k S W I F T C a p t i o n > C o m p a n y   B a n k   S W I F T   C a p t i o n < / C o m p a n y B a n k S W I F T C a p t i o n > - 
-             < C o m p a n y G i r o N o > C o m p a n y   G i r o   N o . < / C o m p a n y G i r o N o > - 
-             < C o m p a n y G i r o N o C a p t i o n > C o m p a n y   G i r o   N o .   C a p t i o n < / C o m p a n y G i r o N o C a p t i o n > - 
-         < / C o m p a n y M e t a d a t a > - 
      < / B C R e p o r t I n f o r m a t i o n >   
-     < T o o l t i p s > - 
-         < T o o l t i p   c o l u m n = " C o m p a n y _ I n f o r m a t i o n _ P i c t u r e "   E l e m e n t I d = " 8 3 5 3 5 2 0 0 6 " > - 
-             < T o o l t i p T e x t   l a n g = " e n - U S " > S p e c i f i e s   t h e   p i c t u r e   t h a t   h a s   b e e n   s e t   u p   f o r   t h e   c o m p a n y ,   s u c h   a s   a   c o m p a n y   l o g o . < / T o o l t i p T e x t > - 
-         < / T o o l t i p > - 
-         < T o o l t i p   c o l u m n = " C o m p a n y _ I n f o r m a t i o n _ N a m e "   E l e m e n t I d = " 3 1 0 5 7 6 0 0 9 " > - 
-             < T o o l t i p T e x t   l a n g = " e n - U S " > S p e c i f i e s   t h e   c o m p a n y ' s   n a m e   a n d   c o r p o r a t e   f o r m .   F o r   e x a m p l e ,   I n c .   o r   L t d . < / T o o l t i p T e x t > - 
-         < / T o o l t i p > - 
-         < T o o l t i p   c o l u m n = " C o m p a n y _ I n f o r m a t i o n _ A d d r e s s "   E l e m e n t I d = " 8 0 9 9 4 7 6 8 0 " > - 
-             < T o o l t i p T e x t   l a n g = " e n - U S " > S p e c i f i e s   t h e   c o m p a n y ' s   a d d r e s s . < / T o o l t i p T e x t > - 
-         < / T o o l t i p > - 
-         < T o o l t i p   c o l u m n = " C o m p a n y _ I n f o r m a t i o n _ A d d r e s s _ 2 "   E l e m e n t I d = " 2 4 8 5 5 4 4 3 " > - 
-             < T o o l t i p T e x t   l a n g = " e n - U S " > S p e c i f i e s   a d d i t i o n a l   a d d r e s s   i n f o r m a t i o n . < / T o o l t i p T e x t > - 
-         < / T o o l t i p > - 
-         < T o o l t i p   c o l u m n = " C o m p a n y _ I n f o r m a t i o n _ P o s t _ C o d e "   E l e m e n t I d = " 1 7 3 1 9 5 5 0 2 8 " > - 
-             < T o o l t i p T e x t   l a n g = " e n - U S " > S p e c i f i e s   t h e   p o s t a l   c o d e . < / T o o l t i p T e x t > - 
-         < / T o o l t i p > - 
-         < T o o l t i p   c o l u m n = " C o m p a n y _ I n f o r m a t i o n _ C i t y "   E l e m e n t I d = " 1 0 0 2 4 9 4 2 6 5 " > - 
-             < T o o l t i p T e x t   l a n g = " e n - U S " > S p e c i f i e s   t h e   c o m p a n y ' s   c i t y . < / T o o l t i p T e x t > - 
-         < / T o o l t i p > - 
-         < T o o l t i p   c o l u m n = " S a l e s p e r s o n P u r c h a s e r _ N a m e "   E l e m e n t I d = " 1 9 0 9 5 6 4 5 7 " > - 
-             < T o o l t i p T e x t   l a n g = " e n - U S " > S p e c i f i e s   t h e   n a m e   o f   t h e   s a l e s p e r s o n   o r   p u r c h a s e r . < / T o o l t i p T e x t > - 
-         < / T o o l t i p > - 
-         < T o o l t i p   c o l u m n = " S a l e s p e r s o n P u r c h a s e r _ J o b _ T i t l e "   E l e m e n t I d = " 1 9 4 4 9 3 6 3 9 8 " > - 
-             < T o o l t i p T e x t   l a n g = " e n - U S " > S p e c i f i e s   t h e   s a l e s p e r s o n ' s   j o b   t i t l e . < / T o o l t i p T e x t > - 
-         < / T o o l t i p > - 
-     < / T o o l t i p s > +     < T o o l t i p s / >   
      < I n t e g e r   E l e m e n t T y p e = " D a t a I t e m "   E l e m e n t I d = " 1 7 3 5 6 9 8 6 1 9 " >   
@@ -1891,7 +1954,7 @@
  
          < C o m p a n y _ I n f o r m a t i o n _ N a m e   E l e m e n t T y p e = " C o l u m n "   E l e m e n t I d = " 3 1 0 5 7 6 0 0 9 "   D a t a T y p e = " T e x t " > C o m p a n y _ I n f o r m a t i o n _ N a m e < / C o m p a n y _ I n f o r m a t i o n _ N a m e >   
-         < C o m p a n y _ I n f o r m a t i o n _ P i c t u r e   E l e m e n t T y p e = " C o l u m n "   E l e m e n t I d = " 8 3 5 3 5 2 0 0 6 "   D a t a T y p e = " B l o b "   / > +         < C o m p a n y _ I n f o r m a t i o n _ P i c t u r e   E l e m e n t T y p e = " C o l u m n "   E l e m e n t I d = " 8 3 5 3 5 2 0 0 6 "   D a t a T y p e = " B L O B " / >   
          < C o m p a n y _ I n f o r m a t i o n _ P o s t _ C o d e   E l e m e n t T y p e = " C o l u m n "   E l e m e n t I d = " 1 7 3 1 9 5 5 0 2 8 "   D a t a T y p e = " C o d e " > C o m p a n y _ I n f o r m a t i o n _ P o s t _ C o d e < / C o m p a n y _ I n f o r m a t i o n _ P o s t _ C o d e >   

</xml_diff>

<commit_message>
New metadata in xml
</commit_message>
<xml_diff>
--- a/src/Layers/W1/BaseApp/CRM/DefaultEmailMergeDocBody.docx
+++ b/src/Layers/W1/BaseApp/CRM/DefaultEmailMergeDocBody.docx
@@ -1777,7 +1777,9 @@
 </we:webextension>
 </file>
 
-<file path=customXml/item1.xml>��< ? x m l   v e r s i o n = " 1 . 0 "   e n c o d i n g = " u t f - 1 6 " ? > < N a v W o r d R e p o r t X m l P a r t   x m l n s = " u r n : m i c r o s o f t - d y n a m i c s - n a v / r e p o r t s / E m a i l _ M e r g e / 5 0 8 4 / " > +<file path=customXml/item1.xml>��< ? x m l   v e r s i o n = " 1 . 0 "   e n c o d i n g = " u t f - 1 6 " ? > + 
+ < N a v W o r d R e p o r t X m l P a r t   x m l n s = " u r n : m i c r o s o f t - d y n a m i c s - n a v / r e p o r t s / E m a i l _ M e r g e / 5 0 8 4 / " >   
      < B C R e p o r t I n f o r m a t i o n >   
@@ -1841,6 +1843,84 @@
  
          < / R e p o r t R e q u e s t >   
+         < C o m p a n y M e t a d a t a > + 
+             < C o m p a n y N a m e > C o m p a n y   N a m e < / C o m p a n y N a m e > + 
+             < C o m p a n y D i s p l a y N a m e > C o m p a n y   D i s p l a y   N a m e < / C o m p a n y D i s p l a y N a m e > + 
+             < C o m p a n y A d d r e s s L i n e s > + 
+                 < C o m p a n y A d d r e s s L i n e > C o m p a n y   A d d r e s s   L i n e   1 < / C o m p a n y A d d r e s s L i n e > + 
+                 < C o m p a n y A d d r e s s L i n e > C o m p a n y   A d d r e s s   L i n e   2 < / C o m p a n y A d d r e s s L i n e > + 
+                 < C o m p a n y A d d r e s s L i n e > C o m p a n y   A d d r e s s   L i n e   3 < / C o m p a n y A d d r e s s L i n e > + 
+                 < C o m p a n y A d d r e s s L i n e > C o m p a n y   A d d r e s s   L i n e   4 < / C o m p a n y A d d r e s s L i n e > + 
+                 < C o m p a n y A d d r e s s L i n e > C o m p a n y   A d d r e s s   L i n e   5 < / C o m p a n y A d d r e s s L i n e > + 
+                 < C o m p a n y A d d r e s s L i n e > C o m p a n y   A d d r e s s   L i n e   6 < / C o m p a n y A d d r e s s L i n e > + 
+                 < C o m p a n y A d d r e s s L i n e > C o m p a n y   A d d r e s s   L i n e   7 < / C o m p a n y A d d r e s s L i n e > + 
+                 < C o m p a n y A d d r e s s L i n e > C o m p a n y   A d d r e s s   L i n e   8 < / C o m p a n y A d d r e s s L i n e > + 
+             < / C o m p a n y A d d r e s s L i n e s > + 
+             < C o m p a n y P h o n e > C o m p a n y   P h o n e < / C o m p a n y P h o n e > + 
+             < C o m p a n y P h o n e C a p t i o n > C o m p a n y   P h o n e   C a p t i o n < / C o m p a n y P h o n e C a p t i o n > + 
+             < C o m p a n y F a x N o > C o m p a n y   F a x   N o . < / C o m p a n y F a x N o > + 
+             < C o m p a n y F a x N o C a p t i o n > C o m p a n y   F a x   N o .   C a p t i o n < / C o m p a n y F a x N o C a p t i o n > + 
+             < C o m p a n y E m a i l > C o m p a n y   E m a i l < / C o m p a n y E m a i l > + 
+             < C o m p a n y E m a i l C a p t i o n > C o m p a n y   E m a i l   C a p t i o n < / C o m p a n y E m a i l C a p t i o n > + 
+             < C o m p a n y H o m e P a g e > C o m p a n y   H o m e   P a g e < / C o m p a n y H o m e P a g e > + 
+             < C o m p a n y H o m e P a g e C a p t i o n > C o m p a n y   H o m e   P a g e   C a p t i o n < / C o m p a n y H o m e P a g e C a p t i o n > + 
+             < C o m p a n y L o g o > C o m p a n y   L o g o < / C o m p a n y L o g o > + 
+             < C o m p a n y V A T R e g i s t r a t i o n N o > C o m p a n y   V A T   R e g i s t r a t i o n   N o . < / C o m p a n y V A T R e g i s t r a t i o n N o > + 
+             < C o m p a n y V A T R e g i s t r a t i o n N o C a p t i o n > C o m p a n y   V A T   R e g i s t r a t i o n   N o .   C a p t i o n < / C o m p a n y V A T R e g i s t r a t i o n N o C a p t i o n > + 
+             < C o m p a n y R e g i s t r a t i o n N o > C o m p a n y   R e g i s t r a t i o n   N o . < / C o m p a n y R e g i s t r a t i o n N o > + 
+             < C o m p a n y R e g i s t r a t i o n N o C a p t i o n > C o m p a n y   R e g i s t r a t i o n   N o .   C a p t i o n < / C o m p a n y R e g i s t r a t i o n N o C a p t i o n > + 
+             < C o m p a n y B a n k N a m e > C o m p a n y   B a n k   N a m e < / C o m p a n y B a n k N a m e > + 
+             < C o m p a n y B a n k N a m e C a p t i o n > C o m p a n y   B a n k   N a m e   C a p t i o n < / C o m p a n y B a n k N a m e C a p t i o n > + 
+             < C o m p a n y B a n k A c c o u n t N o > C o m p a n y   B a n k   A c c o u n t   N o . < / C o m p a n y B a n k A c c o u n t N o > + 
+             < C o m p a n y B a n k A c c o u n t N o C a p t i o n > C o m p a n y   B a n k   A c c o u n t   N o .   C a p t i o n < / C o m p a n y B a n k A c c o u n t N o C a p t i o n > + 
+             < C o m p a n y B a n k B r a n c h N o > C o m p a n y   B a n k   B r a n c h   N o . < / C o m p a n y B a n k B r a n c h N o > + 
+             < C o m p a n y B a n k B r a n c h N o C a p t i o n > C o m p a n y   B a n k   B r a n c h   N o .   C a p t i o n < / C o m p a n y B a n k B r a n c h N o C a p t i o n > + 
+             < C o m p a n y I B A N > C o m p a n y   I B A N < / C o m p a n y I B A N > + 
+             < C o m p a n y I B A N C a p t i o n > C o m p a n y   I B A N   C a p t i o n < / C o m p a n y I B A N C a p t i o n > + 
+             < C o m p a n y B a n k S W I F T > C o m p a n y   B a n k   S W I F T < / C o m p a n y B a n k S W I F T > + 
+             < C o m p a n y B a n k S W I F T C a p t i o n > C o m p a n y   B a n k   S W I F T   C a p t i o n < / C o m p a n y B a n k S W I F T C a p t i o n > + 
+             < C o m p a n y G i r o N o > C o m p a n y   G i r o   N o . < / C o m p a n y G i r o N o > + 
+             < C o m p a n y G i r o N o C a p t i o n > C o m p a n y   G i r o   N o .   C a p t i o n < / C o m p a n y G i r o N o C a p t i o n > + 
+         < / C o m p a n y M e t a d a t a > + 
      < / B C R e p o r t I n f o r m a t i o n >   
      < I n t e g e r > @@ -1853,7 +1933,7 @@
  
          < C o m p a n y _ I n f o r m a t i o n _ N a m e > C o m p a n y _ I n f o r m a t i o n _ N a m e < / C o m p a n y _ I n f o r m a t i o n _ N a m e >   
-         < C o m p a n y _ I n f o r m a t i o n _ P i c t u r e / > +         < C o m p a n y _ I n f o r m a t i o n _ P i c t u r e   / >   
          < C o m p a n y _ I n f o r m a t i o n _ P o s t _ C o d e > C o m p a n y _ I n f o r m a t i o n _ P o s t _ C o d e < / C o m p a n y _ I n f o r m a t i o n _ P o s t _ C o d e >   
@@ -1876,7 +1956,9 @@
  < / N a v W o r d R e p o r t X m l P a r t > 
 </file>
 
-<file path=customXml/item2.xml>��< ? x m l   v e r s i o n = " 1 . 0 "   e n c o d i n g = " u t f - 1 6 " ? > < N a v W o r d R e p o r t X m l P a r t   x m l n s = " u r n : m i c r o s o f t - d y n a m i c s - b u s i n e s s c e n t r a l / i n t e r n a l / e x t e n d e d / r e p o r t s / E m a i l _ M e r g e / 5 0 8 4 / " > +<file path=customXml/item2.xml>��< ? x m l   v e r s i o n = " 1 . 0 "   e n c o d i n g = " u t f - 1 6 " ? > + 
+ < N a v W o r d R e p o r t X m l P a r t   x m l n s = " u r n : m i c r o s o f t - d y n a m i c s - b u s i n e s s c e n t r a l / i n t e r n a l / e x t e n d e d / r e p o r t s / E m a i l _ M e r g e / 5 0 8 4 / " >   
      < B C R e p o r t I n f o r m a t i o n >   
@@ -1940,9 +2022,137 @@
  
          < / R e p o r t R e q u e s t >   
+         < C o m p a n y M e t a d a t a > + 
+             < C o m p a n y N a m e > C o m p a n y   N a m e < / C o m p a n y N a m e > + 
+             < C o m p a n y D i s p l a y N a m e > C o m p a n y   D i s p l a y   N a m e < / C o m p a n y D i s p l a y N a m e > + 
+             < C o m p a n y A d d r e s s L i n e s > + 
+                 < C o m p a n y A d d r e s s L i n e > C o m p a n y   A d d r e s s   L i n e   1 < / C o m p a n y A d d r e s s L i n e > + 
+                 < C o m p a n y A d d r e s s L i n e > C o m p a n y   A d d r e s s   L i n e   2 < / C o m p a n y A d d r e s s L i n e > + 
+                 < C o m p a n y A d d r e s s L i n e > C o m p a n y   A d d r e s s   L i n e   3 < / C o m p a n y A d d r e s s L i n e > + 
+                 < C o m p a n y A d d r e s s L i n e > C o m p a n y   A d d r e s s   L i n e   4 < / C o m p a n y A d d r e s s L i n e > + 
+                 < C o m p a n y A d d r e s s L i n e > C o m p a n y   A d d r e s s   L i n e   5 < / C o m p a n y A d d r e s s L i n e > + 
+                 < C o m p a n y A d d r e s s L i n e > C o m p a n y   A d d r e s s   L i n e   6 < / C o m p a n y A d d r e s s L i n e > + 
+                 < C o m p a n y A d d r e s s L i n e > C o m p a n y   A d d r e s s   L i n e   7 < / C o m p a n y A d d r e s s L i n e > + 
+                 < C o m p a n y A d d r e s s L i n e > C o m p a n y   A d d r e s s   L i n e   8 < / C o m p a n y A d d r e s s L i n e > + 
+             < / C o m p a n y A d d r e s s L i n e s > + 
+             < C o m p a n y P h o n e > C o m p a n y   P h o n e < / C o m p a n y P h o n e > + 
+             < C o m p a n y P h o n e C a p t i o n > C o m p a n y   P h o n e   C a p t i o n < / C o m p a n y P h o n e C a p t i o n > + 
+             < C o m p a n y F a x N o > C o m p a n y   F a x   N o . < / C o m p a n y F a x N o > + 
+             < C o m p a n y F a x N o C a p t i o n > C o m p a n y   F a x   N o .   C a p t i o n < / C o m p a n y F a x N o C a p t i o n > + 
+             < C o m p a n y E m a i l > C o m p a n y   E m a i l < / C o m p a n y E m a i l > + 
+             < C o m p a n y E m a i l C a p t i o n > C o m p a n y   E m a i l   C a p t i o n < / C o m p a n y E m a i l C a p t i o n > + 
+             < C o m p a n y H o m e P a g e > C o m p a n y   H o m e   P a g e < / C o m p a n y H o m e P a g e > + 
+             < C o m p a n y H o m e P a g e C a p t i o n > C o m p a n y   H o m e   P a g e   C a p t i o n < / C o m p a n y H o m e P a g e C a p t i o n > + 
+             < C o m p a n y L o g o > C o m p a n y   L o g o < / C o m p a n y L o g o > + 
+             < C o m p a n y V A T R e g i s t r a t i o n N o > C o m p a n y   V A T   R e g i s t r a t i o n   N o . < / C o m p a n y V A T R e g i s t r a t i o n N o > + 
+             < C o m p a n y V A T R e g i s t r a t i o n N o C a p t i o n > C o m p a n y   V A T   R e g i s t r a t i o n   N o .   C a p t i o n < / C o m p a n y V A T R e g i s t r a t i o n N o C a p t i o n > + 
+             < C o m p a n y R e g i s t r a t i o n N o > C o m p a n y   R e g i s t r a t i o n   N o . < / C o m p a n y R e g i s t r a t i o n N o > + 
+             < C o m p a n y R e g i s t r a t i o n N o C a p t i o n > C o m p a n y   R e g i s t r a t i o n   N o .   C a p t i o n < / C o m p a n y R e g i s t r a t i o n N o C a p t i o n > + 
+             < C o m p a n y B a n k N a m e > C o m p a n y   B a n k   N a m e < / C o m p a n y B a n k N a m e > + 
+             < C o m p a n y B a n k N a m e C a p t i o n > C o m p a n y   B a n k   N a m e   C a p t i o n < / C o m p a n y B a n k N a m e C a p t i o n > + 
+             < C o m p a n y B a n k A c c o u n t N o > C o m p a n y   B a n k   A c c o u n t   N o . < / C o m p a n y B a n k A c c o u n t N o > + 
+             < C o m p a n y B a n k A c c o u n t N o C a p t i o n > C o m p a n y   B a n k   A c c o u n t   N o .   C a p t i o n < / C o m p a n y B a n k A c c o u n t N o C a p t i o n > + 
+             < C o m p a n y B a n k B r a n c h N o > C o m p a n y   B a n k   B r a n c h   N o . < / C o m p a n y B a n k B r a n c h N o > + 
+             < C o m p a n y B a n k B r a n c h N o C a p t i o n > C o m p a n y   B a n k   B r a n c h   N o .   C a p t i o n < / C o m p a n y B a n k B r a n c h N o C a p t i o n > + 
+             < C o m p a n y I B A N > C o m p a n y   I B A N < / C o m p a n y I B A N > + 
+             < C o m p a n y I B A N C a p t i o n > C o m p a n y   I B A N   C a p t i o n < / C o m p a n y I B A N C a p t i o n > + 
+             < C o m p a n y B a n k S W I F T > C o m p a n y   B a n k   S W I F T < / C o m p a n y B a n k S W I F T > + 
+             < C o m p a n y B a n k S W I F T C a p t i o n > C o m p a n y   B a n k   S W I F T   C a p t i o n < / C o m p a n y B a n k S W I F T C a p t i o n > + 
+             < C o m p a n y G i r o N o > C o m p a n y   G i r o   N o . < / C o m p a n y G i r o N o > + 
+             < C o m p a n y G i r o N o C a p t i o n > C o m p a n y   G i r o   N o .   C a p t i o n < / C o m p a n y G i r o N o C a p t i o n > + 
+         < / C o m p a n y M e t a d a t a > + 
      < / B C R e p o r t I n f o r m a t i o n >   
-     < T o o l t i p s / > +     < T o o l t i p s > + 
+         < T o o l t i p   c o l u m n = " C o m p a n y _ I n f o r m a t i o n _ P i c t u r e "   E l e m e n t I d = " 8 3 5 3 5 2 0 0 6 " > + 
+             < T o o l t i p T e x t   l a n g = " e n - U S " > S p e c i f i e s   t h e   p i c t u r e   t h a t   h a s   b e e n   s e t   u p   f o r   t h e   c o m p a n y ,   s u c h   a s   a   c o m p a n y   l o g o . < / T o o l t i p T e x t > + 
+         < / T o o l t i p > + 
+         < T o o l t i p   c o l u m n = " C o m p a n y _ I n f o r m a t i o n _ N a m e "   E l e m e n t I d = " 3 1 0 5 7 6 0 0 9 " > + 
+             < T o o l t i p T e x t   l a n g = " e n - U S " > S p e c i f i e s   t h e   c o m p a n y ' s   n a m e   a n d   c o r p o r a t e   f o r m .   F o r   e x a m p l e ,   I n c .   o r   L t d . < / T o o l t i p T e x t > + 
+         < / T o o l t i p > + 
+         < T o o l t i p   c o l u m n = " C o m p a n y _ I n f o r m a t i o n _ A d d r e s s "   E l e m e n t I d = " 8 0 9 9 4 7 6 8 0 " > + 
+             < T o o l t i p T e x t   l a n g = " e n - U S " > S p e c i f i e s   t h e   c o m p a n y ' s   a d d r e s s . < / T o o l t i p T e x t > + 
+         < / T o o l t i p > + 
+         < T o o l t i p   c o l u m n = " C o m p a n y _ I n f o r m a t i o n _ A d d r e s s _ 2 "   E l e m e n t I d = " 2 4 8 5 5 4 4 3 " > + 
+             < T o o l t i p T e x t   l a n g = " e n - U S " > S p e c i f i e s   a d d i t i o n a l   a d d r e s s   i n f o r m a t i o n . < / T o o l t i p T e x t > + 
+         < / T o o l t i p > + 
+         < T o o l t i p   c o l u m n = " C o m p a n y _ I n f o r m a t i o n _ P o s t _ C o d e "   E l e m e n t I d = " 1 7 3 1 9 5 5 0 2 8 " > + 
+             < T o o l t i p T e x t   l a n g = " e n - U S " > S p e c i f i e s   t h e   p o s t a l   c o d e . < / T o o l t i p T e x t > + 
+         < / T o o l t i p > + 
+         < T o o l t i p   c o l u m n = " C o m p a n y _ I n f o r m a t i o n _ C i t y "   E l e m e n t I d = " 1 0 0 2 4 9 4 2 6 5 " > + 
+             < T o o l t i p T e x t   l a n g = " e n - U S " > S p e c i f i e s   t h e   c o m p a n y ' s   c i t y . < / T o o l t i p T e x t > + 
+         < / T o o l t i p > + 
+         < T o o l t i p   c o l u m n = " S a l e s p e r s o n P u r c h a s e r _ N a m e "   E l e m e n t I d = " 1 9 0 9 5 6 4 5 7 " > + 
+             < T o o l t i p T e x t   l a n g = " e n - U S " > S p e c i f i e s   t h e   n a m e   o f   t h e   s a l e s p e r s o n   o r   p u r c h a s e r . < / T o o l t i p T e x t > + 
+         < / T o o l t i p > + 
+         < T o o l t i p   c o l u m n = " S a l e s p e r s o n P u r c h a s e r _ J o b _ T i t l e "   E l e m e n t I d = " 1 9 4 4 9 3 6 3 9 8 " > + 
+             < T o o l t i p T e x t   l a n g = " e n - U S " > S p e c i f i e s   t h e   s a l e s p e r s o n ' s   j o b   t i t l e . < / T o o l t i p T e x t > + 
+         < / T o o l t i p > + 
+     < / T o o l t i p s >   
      < I n t e g e r   E l e m e n t T y p e = " D a t a I t e m "   E l e m e n t I d = " 1 7 3 5 6 9 8 6 1 9 " >   
@@ -1954,7 +2164,7 @@
  
          < C o m p a n y _ I n f o r m a t i o n _ N a m e   E l e m e n t T y p e = " C o l u m n "   E l e m e n t I d = " 3 1 0 5 7 6 0 0 9 "   D a t a T y p e = " T e x t " > C o m p a n y _ I n f o r m a t i o n _ N a m e < / C o m p a n y _ I n f o r m a t i o n _ N a m e >   
-         < C o m p a n y _ I n f o r m a t i o n _ P i c t u r e   E l e m e n t T y p e = " C o l u m n "   E l e m e n t I d = " 8 3 5 3 5 2 0 0 6 "   D a t a T y p e = " B L O B " / > +         < C o m p a n y _ I n f o r m a t i o n _ P i c t u r e   E l e m e n t T y p e = " C o l u m n "   E l e m e n t I d = " 8 3 5 3 5 2 0 0 6 "   D a t a T y p e = " B l o b "   / >   
          < C o m p a n y _ I n f o r m a t i o n _ P o s t _ C o d e   E l e m e n t T y p e = " C o l u m n "   E l e m e n t I d = " 1 7 3 1 9 5 5 0 2 8 "   D a t a T y p e = " C o d e " > C o m p a n y _ I n f o r m a t i o n _ P o s t _ C o d e < / C o m p a n y _ I n f o r m a t i o n _ P o s t _ C o d e >   

</xml_diff>